<commit_message>
Added presentation & MPR for month of October
</commit_message>
<xml_diff>
--- a/Format for Monthly Progress Report (MPR).docx
+++ b/Format for Monthly Progress Report (MPR).docx
@@ -219,7 +219,7 @@
           </mc:Choice>
           <mc:Fallback>
             <w:pict>
-              <v:shape w14:anchorId="39EF3122" id="Graphic 2" o:spid="_x0000_s1026" style="position:absolute;margin-left:90.85pt;margin-top:15.3pt;width:415.45pt;height:.1pt;z-index:-15728640;visibility:visible;mso-wrap-style:square;mso-wrap-distance-left:0;mso-wrap-distance-top:0;mso-wrap-distance-right:0;mso-wrap-distance-bottom:0;mso-position-horizontal:absolute;mso-position-horizontal-relative:page;mso-position-vertical:absolute;mso-position-vertical-relative:text;v-text-anchor:top" coordsize="5276215,1270" o:gfxdata="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" path="m,l5276215,e" filled="f" strokeweight="1.5pt">
+              <v:shape w14:anchorId="35501DB5" id="Graphic 2" o:spid="_x0000_s1026" style="position:absolute;margin-left:90.85pt;margin-top:15.3pt;width:415.45pt;height:.1pt;z-index:-15728640;visibility:visible;mso-wrap-style:square;mso-wrap-distance-left:0;mso-wrap-distance-top:0;mso-wrap-distance-right:0;mso-wrap-distance-bottom:0;mso-position-horizontal:absolute;mso-position-horizontal-relative:page;mso-position-vertical:absolute;mso-position-vertical-relative:text;v-text-anchor:top" coordsize="5276215,1270" o:gfxdata="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" path="m,l5276215,e" filled="f" strokeweight="1.5pt">
                 <v:path arrowok="t"/>
                 <w10:wrap type="topAndBottom" anchorx="page"/>
               </v:shape>
@@ -381,6 +381,13 @@
         </w:rPr>
         <w:t>Department:</w:t>
       </w:r>
+      <w:r>
+        <w:rPr>
+          <w:spacing w:val="-2"/>
+          <w:sz w:val="20"/>
+        </w:rPr>
+        <w:t xml:space="preserve"> Computer Science (H)</w:t>
+      </w:r>
     </w:p>
     <w:p>
       <w:pPr>
@@ -500,6 +507,14 @@
         </w:rPr>
         <w:t xml:space="preserve"> Generation (RAG) Strategies</w:t>
       </w:r>
+      <w:r>
+        <w:rPr>
+          <w:spacing w:val="-4"/>
+          <w:sz w:val="20"/>
+          <w:lang w:val="en-IN"/>
+        </w:rPr>
+        <w:t>, a comparative study.</w:t>
+      </w:r>
     </w:p>
     <w:p>
       <w:pPr>
@@ -601,6 +616,13 @@
         </w:rPr>
         <w:t>meeting:</w:t>
       </w:r>
+      <w:r>
+        <w:rPr>
+          <w:spacing w:val="-2"/>
+          <w:sz w:val="20"/>
+        </w:rPr>
+        <w:t xml:space="preserve"> </w:t>
+      </w:r>
     </w:p>
     <w:p>
       <w:pPr>
@@ -1473,8 +1495,6 @@
         </w:rPr>
         <w:t xml:space="preserve"> </w:t>
       </w:r>
-      <w:proofErr w:type="spellStart"/>
-      <w:proofErr w:type="gramStart"/>
       <w:r>
         <w:rPr>
           <w:spacing w:val="-5"/>
@@ -1487,16 +1507,14 @@
           <w:spacing w:val="-5"/>
           <w:u w:val="none"/>
         </w:rPr>
-        <w:t>Ankit</w:t>
-      </w:r>
-      <w:proofErr w:type="spellEnd"/>
-      <w:proofErr w:type="gramEnd"/>
+        <w:t xml:space="preserve"> </w:t>
+      </w:r>
       <w:r>
         <w:rPr>
           <w:spacing w:val="-5"/>
           <w:u w:val="none"/>
         </w:rPr>
-        <w:t xml:space="preserve"> Mahto</w:t>
+        <w:t>Ankit Mahto</w:t>
       </w:r>
     </w:p>
     <w:p>
@@ -2184,10 +2202,24 @@
           <w:p>
             <w:pPr>
               <w:pStyle w:val="TableParagraph"/>
+              <w:jc w:val="center"/>
               <w:rPr>
                 <w:sz w:val="18"/>
               </w:rPr>
             </w:pPr>
+            <w:r>
+              <w:rPr>
+                <w:sz w:val="18"/>
+              </w:rPr>
+              <w:t xml:space="preserve">Dr. Vidhi </w:t>
+            </w:r>
+            <w:r>
+              <w:rPr>
+                <w:sz w:val="18"/>
+                <w:lang w:val="en-IN"/>
+              </w:rPr>
+              <w:t>Khanduja</w:t>
+            </w:r>
           </w:p>
         </w:tc>
         <w:tc>
@@ -2276,10 +2308,17 @@
           <w:p>
             <w:pPr>
               <w:pStyle w:val="TableParagraph"/>
+              <w:jc w:val="center"/>
               <w:rPr>
                 <w:sz w:val="18"/>
               </w:rPr>
             </w:pPr>
+            <w:r>
+              <w:rPr>
+                <w:sz w:val="18"/>
+              </w:rPr>
+              <w:t>Dr. Suyash Kumar</w:t>
+            </w:r>
           </w:p>
         </w:tc>
         <w:tc>
@@ -2396,6 +2435,24 @@
           <w:p>
             <w:pPr>
               <w:pStyle w:val="TableParagraph"/>
+              <w:jc w:val="center"/>
+              <w:rPr>
+                <w:sz w:val="18"/>
+                <w:lang w:val="en-IN"/>
+              </w:rPr>
+            </w:pPr>
+            <w:r>
+              <w:rPr>
+                <w:sz w:val="18"/>
+                <w:lang w:val="en-IN"/>
+              </w:rPr>
+              <w:t>Dr. Rangoli Bhatnagar</w:t>
+            </w:r>
+          </w:p>
+          <w:p>
+            <w:pPr>
+              <w:pStyle w:val="TableParagraph"/>
+              <w:jc w:val="center"/>
               <w:rPr>
                 <w:sz w:val="18"/>
               </w:rPr>

</xml_diff>